<commit_message>
feat: add power flow report, CSV datasets, and visualization figures
</commit_message>
<xml_diff>
--- a/report/02_Vietnamese_Report/Project_I_Report_HUST_Vietnamese_v2.docx
+++ b/report/02_Vietnamese_Report/Project_I_Report_HUST_Vietnamese_v2.docx
@@ -879,7 +879,7 @@
                 <w:rFonts w:ascii="Times New Roman" w:hAnsi="Times New Roman"/>
                 <w:sz w:val="19"/>
               </w:rPr>
-              <w:t>0.48960000</w:t>
+              <w:t>0.48266667</w:t>
             </w:r>
           </w:p>
         </w:tc>
@@ -903,7 +903,7 @@
                 <w:rFonts w:ascii="Times New Roman" w:hAnsi="Times New Roman"/>
                 <w:sz w:val="19"/>
               </w:rPr>
-              <w:t>0.48960000</w:t>
+              <w:t>0.48266667</w:t>
             </w:r>
           </w:p>
         </w:tc>
@@ -977,7 +977,7 @@
                 <w:rFonts w:ascii="Times New Roman" w:hAnsi="Times New Roman"/>
                 <w:sz w:val="19"/>
               </w:rPr>
-              <w:t>-1.06250000</w:t>
+              <w:t>-1.07083333</w:t>
             </w:r>
           </w:p>
         </w:tc>
@@ -1001,7 +1001,7 @@
                 <w:rFonts w:ascii="Times New Roman" w:hAnsi="Times New Roman"/>
                 <w:sz w:val="19"/>
               </w:rPr>
-              <w:t>-1.06250000</w:t>
+              <w:t>-1.07083333</w:t>
             </w:r>
           </w:p>
         </w:tc>
@@ -1173,7 +1173,7 @@
                 <w:rFonts w:ascii="Times New Roman" w:hAnsi="Times New Roman"/>
                 <w:sz w:val="19"/>
               </w:rPr>
-              <w:t>21.85872000</w:t>
+              <w:t>21.58000000</w:t>
             </w:r>
           </w:p>
         </w:tc>
@@ -1197,7 +1197,7 @@
                 <w:rFonts w:ascii="Times New Roman" w:hAnsi="Times New Roman"/>
                 <w:sz w:val="19"/>
               </w:rPr>
-              <w:t>21.85872000</w:t>
+              <w:t>21.58000000</w:t>
             </w:r>
           </w:p>
         </w:tc>
@@ -1565,7 +1565,7 @@
                 <w:rFonts w:ascii="Times New Roman" w:hAnsi="Times New Roman"/>
                 <w:sz w:val="19"/>
               </w:rPr>
-              <w:t>-0.00774635</w:t>
+              <w:t>-0.00716985</w:t>
             </w:r>
           </w:p>
         </w:tc>
@@ -1589,7 +1589,7 @@
                 <w:rFonts w:ascii="Times New Roman" w:hAnsi="Times New Roman"/>
                 <w:sz w:val="19"/>
               </w:rPr>
-              <w:t>-0.00774635</w:t>
+              <w:t>-0.00716985</w:t>
             </w:r>
           </w:p>
         </w:tc>
@@ -1663,7 +1663,7 @@
                 <w:rFonts w:ascii="Times New Roman" w:hAnsi="Times New Roman"/>
                 <w:sz w:val="19"/>
               </w:rPr>
-              <w:t>-0.11565012</w:t>
+              <w:t>-0.10719976</w:t>
             </w:r>
           </w:p>
         </w:tc>
@@ -1687,7 +1687,7 @@
                 <w:rFonts w:ascii="Times New Roman" w:hAnsi="Times New Roman"/>
                 <w:sz w:val="19"/>
               </w:rPr>
-              <w:t>-0.11565012</w:t>
+              <w:t>-0.10719976</w:t>
             </w:r>
           </w:p>
         </w:tc>
@@ -1761,7 +1761,7 @@
                 <w:rFonts w:ascii="Times New Roman" w:hAnsi="Times New Roman"/>
                 <w:sz w:val="19"/>
               </w:rPr>
-              <w:t>-0.05054718</w:t>
+              <w:t>-0.04612691</w:t>
             </w:r>
           </w:p>
         </w:tc>
@@ -1785,7 +1785,7 @@
                 <w:rFonts w:ascii="Times New Roman" w:hAnsi="Times New Roman"/>
                 <w:sz w:val="19"/>
               </w:rPr>
-              <w:t>-0.05054718</w:t>
+              <w:t>-0.04612691</w:t>
             </w:r>
           </w:p>
         </w:tc>
@@ -2172,7 +2172,7 @@
                 <w:rFonts w:ascii="Times New Roman" w:hAnsi="Times New Roman"/>
                 <w:sz w:val="19"/>
               </w:rPr>
-              <w:t>72.2047</w:t>
+              <w:t>76.4522</w:t>
             </w:r>
           </w:p>
         </w:tc>
@@ -2196,7 +2196,7 @@
                 <w:rFonts w:ascii="Times New Roman" w:hAnsi="Times New Roman"/>
                 <w:sz w:val="19"/>
               </w:rPr>
-              <w:t>28.6141</w:t>
+              <w:t>34.9226</w:t>
             </w:r>
           </w:p>
         </w:tc>
@@ -2342,7 +2342,7 @@
                 <w:rFonts w:ascii="Times New Roman" w:hAnsi="Times New Roman"/>
                 <w:sz w:val="19"/>
               </w:rPr>
-              <w:t>-0.4831</w:t>
+              <w:t>-0.4934</w:t>
             </w:r>
           </w:p>
         </w:tc>
@@ -2390,7 +2390,7 @@
                 <w:rFonts w:ascii="Times New Roman" w:hAnsi="Times New Roman"/>
                 <w:sz w:val="19"/>
               </w:rPr>
-              <w:t>28.0000</w:t>
+              <w:t>18.9489</w:t>
             </w:r>
           </w:p>
         </w:tc>
@@ -2512,7 +2512,7 @@
                 <w:rFonts w:ascii="Times New Roman" w:hAnsi="Times New Roman"/>
                 <w:sz w:val="19"/>
               </w:rPr>
-              <w:t>0.9467</w:t>
+              <w:t>0.9444</w:t>
             </w:r>
           </w:p>
         </w:tc>
@@ -2536,7 +2536,7 @@
                 <w:rFonts w:ascii="Times New Roman" w:hAnsi="Times New Roman"/>
                 <w:sz w:val="19"/>
               </w:rPr>
-              <w:t>-6.7280</w:t>
+              <w:t>-6.5482</w:t>
             </w:r>
           </w:p>
         </w:tc>
@@ -2893,7 +2893,7 @@
                 <w:rFonts w:ascii="Times New Roman" w:hAnsi="Times New Roman"/>
                 <w:sz w:val="19"/>
               </w:rPr>
-              <w:t>0.9467</w:t>
+              <w:t>0.9444</w:t>
             </w:r>
           </w:p>
         </w:tc>
@@ -2917,7 +2917,7 @@
                 <w:rFonts w:ascii="Times New Roman" w:hAnsi="Times New Roman"/>
                 <w:sz w:val="19"/>
               </w:rPr>
-              <w:t>-6.73</w:t>
+              <w:t>-6.55</w:t>
             </w:r>
           </w:p>
         </w:tc>
@@ -2941,7 +2941,7 @@
                 <w:rFonts w:ascii="Times New Roman" w:hAnsi="Times New Roman"/>
                 <w:sz w:val="19"/>
               </w:rPr>
-              <w:t>2.205</w:t>
+              <w:t>6.452</w:t>
             </w:r>
           </w:p>
         </w:tc>
@@ -3039,7 +3039,7 @@
                 <w:rFonts w:ascii="Times New Roman" w:hAnsi="Times New Roman"/>
                 <w:sz w:val="19"/>
               </w:rPr>
-              <w:t>0.9382</w:t>
+              <w:t>0.9430</w:t>
             </w:r>
           </w:p>
         </w:tc>
@@ -3063,7 +3063,7 @@
                 <w:rFonts w:ascii="Times New Roman" w:hAnsi="Times New Roman"/>
                 <w:sz w:val="19"/>
               </w:rPr>
-              <w:t>-7.81</w:t>
+              <w:t>-9.52</w:t>
             </w:r>
           </w:p>
         </w:tc>
@@ -3087,7 +3087,7 @@
                 <w:rFonts w:ascii="Times New Roman" w:hAnsi="Times New Roman"/>
                 <w:sz w:val="19"/>
               </w:rPr>
-              <w:t>2.741</w:t>
+              <w:t>7.142</w:t>
             </w:r>
           </w:p>
         </w:tc>
@@ -3185,7 +3185,7 @@
                 <w:rFonts w:ascii="Times New Roman" w:hAnsi="Times New Roman"/>
                 <w:sz w:val="19"/>
               </w:rPr>
-              <w:t>0.9245</w:t>
+              <w:t>0.8202</w:t>
             </w:r>
           </w:p>
         </w:tc>
@@ -3209,7 +3209,7 @@
                 <w:rFonts w:ascii="Times New Roman" w:hAnsi="Times New Roman"/>
                 <w:sz w:val="19"/>
               </w:rPr>
-              <w:t>-9.45</w:t>
+              <w:t>-15.46</w:t>
             </w:r>
           </w:p>
         </w:tc>
@@ -3233,7 +3233,7 @@
                 <w:rFonts w:ascii="Times New Roman" w:hAnsi="Times New Roman"/>
                 <w:sz w:val="19"/>
               </w:rPr>
-              <w:t>3.512</w:t>
+              <w:t>16.322</w:t>
             </w:r>
           </w:p>
         </w:tc>
@@ -3257,7 +3257,7 @@
                 <w:rFonts w:ascii="Times New Roman" w:hAnsi="Times New Roman"/>
                 <w:sz w:val="19"/>
               </w:rPr>
-              <w:t>Điện áp nút 3 giảm</w:t>
+              <w:t>Điện áp thấp</w:t>
             </w:r>
           </w:p>
         </w:tc>
@@ -3331,7 +3331,7 @@
                 <w:rFonts w:ascii="Times New Roman" w:hAnsi="Times New Roman"/>
                 <w:sz w:val="19"/>
               </w:rPr>
-              <w:t>0.9082</w:t>
+              <w:t>0.6472</w:t>
             </w:r>
           </w:p>
         </w:tc>
@@ -3355,7 +3355,7 @@
                 <w:rFonts w:ascii="Times New Roman" w:hAnsi="Times New Roman"/>
                 <w:sz w:val="19"/>
               </w:rPr>
-              <w:t>-11.84</w:t>
+              <w:t>-21.48</w:t>
             </w:r>
           </w:p>
         </w:tc>
@@ -3379,7 +3379,7 @@
                 <w:rFonts w:ascii="Times New Roman" w:hAnsi="Times New Roman"/>
                 <w:sz w:val="19"/>
               </w:rPr>
-              <w:t>4.682</w:t>
+              <w:t>32.738</w:t>
             </w:r>
           </w:p>
         </w:tc>
@@ -3403,7 +3403,7 @@
                 <w:rFonts w:ascii="Times New Roman" w:hAnsi="Times New Roman"/>
                 <w:sz w:val="19"/>
               </w:rPr>
-              <w:t>Nguy hiểm / Quá tải đường dây 1-3</w:t>
+              <w:t>Nguy hiểm / Sụp đổ điện áp</w:t>
             </w:r>
           </w:p>
         </w:tc>

</xml_diff>